<commit_message>
Completa encabezados del informe y verificación visual de páginas
</commit_message>
<xml_diff>
--- a/docs/Horizon_ventajas_desventajas.docx
+++ b/docs/Horizon_ventajas_desventajas.docx
@@ -2906,7 +2906,7 @@
                   <w:szCs w:val="17"/>
                   <w:rtl w:val="0"/>
                 </w:rPr>
-                <w:t xml:space="preserve">Report title</w:t>
+                <w:t xml:space="preserve">Horizon y recuperación</w:t>
               </w:r>
             </w:p>
             <w:p>
@@ -2980,7 +2980,7 @@
                   <w:szCs w:val="17"/>
                   <w:rtl w:val="0"/>
                 </w:rPr>
-                <w:t xml:space="preserve">Date</w:t>
+                <w:t xml:space="preserve">9 septiembre 2026</w:t>
               </w:r>
             </w:p>
           </w:tc>

</xml_diff>

<commit_message>
Corrige paginación e índice del informe Horizon
</commit_message>
<xml_diff>
--- a/docs/Horizon_ventajas_desventajas.docx
+++ b/docs/Horizon_ventajas_desventajas.docx
@@ -409,7 +409,7 @@
           <w:pPr>
             <w:widowControl w:val="0"/>
             <w:tabs>
-              <w:tab w:val="right" w:leader="dot" w:pos="12000"/>
+              <w:tab w:val="right" w:leader="dot" w:pos="9360"/>
             </w:tabs>
             <w:spacing w:after="0" w:before="60" w:line="240" w:lineRule="auto"/>
             <w:rPr>
@@ -457,7 +457,7 @@
           <w:pPr>
             <w:widowControl w:val="0"/>
             <w:tabs>
-              <w:tab w:val="right" w:leader="dot" w:pos="12000"/>
+              <w:tab w:val="right" w:leader="dot" w:pos="9360"/>
             </w:tabs>
             <w:spacing w:after="0" w:before="60" w:line="240" w:lineRule="auto"/>
             <w:ind w:left="360" w:firstLine="0"/>
@@ -499,7 +499,7 @@
           <w:pPr>
             <w:widowControl w:val="0"/>
             <w:tabs>
-              <w:tab w:val="right" w:leader="dot" w:pos="12000"/>
+              <w:tab w:val="right" w:leader="dot" w:pos="9360"/>
             </w:tabs>
             <w:spacing w:after="0" w:before="60" w:line="240" w:lineRule="auto"/>
             <w:ind w:left="360" w:firstLine="0"/>
@@ -541,7 +541,7 @@
           <w:pPr>
             <w:widowControl w:val="0"/>
             <w:tabs>
-              <w:tab w:val="right" w:leader="dot" w:pos="12000"/>
+              <w:tab w:val="right" w:leader="dot" w:pos="9360"/>
             </w:tabs>
             <w:spacing w:after="0" w:before="60" w:line="240" w:lineRule="auto"/>
             <w:rPr>
@@ -584,7 +584,7 @@
           <w:pPr>
             <w:widowControl w:val="0"/>
             <w:tabs>
-              <w:tab w:val="right" w:leader="dot" w:pos="12000"/>
+              <w:tab w:val="right" w:leader="dot" w:pos="9360"/>
             </w:tabs>
             <w:spacing w:after="0" w:before="60" w:line="240" w:lineRule="auto"/>
             <w:ind w:left="360" w:firstLine="0"/>
@@ -626,7 +626,7 @@
           <w:pPr>
             <w:widowControl w:val="0"/>
             <w:tabs>
-              <w:tab w:val="right" w:leader="dot" w:pos="12000"/>
+              <w:tab w:val="right" w:leader="dot" w:pos="9360"/>
             </w:tabs>
             <w:spacing w:after="0" w:before="60" w:line="240" w:lineRule="auto"/>
             <w:ind w:left="360" w:firstLine="0"/>
@@ -668,7 +668,7 @@
           <w:pPr>
             <w:widowControl w:val="0"/>
             <w:tabs>
-              <w:tab w:val="right" w:leader="dot" w:pos="12000"/>
+              <w:tab w:val="right" w:leader="dot" w:pos="9360"/>
             </w:tabs>
             <w:spacing w:after="0" w:before="60" w:line="240" w:lineRule="auto"/>
             <w:ind w:left="360" w:firstLine="0"/>
@@ -710,7 +710,7 @@
           <w:pPr>
             <w:widowControl w:val="0"/>
             <w:tabs>
-              <w:tab w:val="right" w:leader="dot" w:pos="12000"/>
+              <w:tab w:val="right" w:leader="dot" w:pos="9360"/>
             </w:tabs>
             <w:spacing w:after="0" w:before="60" w:line="240" w:lineRule="auto"/>
             <w:rPr>
@@ -753,7 +753,7 @@
           <w:pPr>
             <w:widowControl w:val="0"/>
             <w:tabs>
-              <w:tab w:val="right" w:leader="dot" w:pos="12000"/>
+              <w:tab w:val="right" w:leader="dot" w:pos="9360"/>
             </w:tabs>
             <w:spacing w:after="0" w:before="60" w:line="240" w:lineRule="auto"/>
             <w:ind w:left="360" w:firstLine="0"/>
@@ -795,7 +795,7 @@
           <w:pPr>
             <w:widowControl w:val="0"/>
             <w:tabs>
-              <w:tab w:val="right" w:leader="dot" w:pos="12000"/>
+              <w:tab w:val="right" w:leader="dot" w:pos="9360"/>
             </w:tabs>
             <w:spacing w:after="0" w:before="60" w:line="240" w:lineRule="auto"/>
             <w:rPr>
@@ -838,7 +838,7 @@
           <w:pPr>
             <w:widowControl w:val="0"/>
             <w:tabs>
-              <w:tab w:val="right" w:leader="dot" w:pos="12000"/>
+              <w:tab w:val="right" w:leader="dot" w:pos="9360"/>
             </w:tabs>
             <w:spacing w:after="0" w:before="60" w:line="240" w:lineRule="auto"/>
             <w:ind w:left="360" w:firstLine="0"/>
@@ -880,7 +880,7 @@
           <w:pPr>
             <w:widowControl w:val="0"/>
             <w:tabs>
-              <w:tab w:val="right" w:leader="dot" w:pos="12000"/>
+              <w:tab w:val="right" w:leader="dot" w:pos="9360"/>
             </w:tabs>
             <w:spacing w:after="0" w:before="60" w:line="240" w:lineRule="auto"/>
             <w:ind w:left="360" w:firstLine="0"/>
@@ -1157,6 +1157,7 @@
     <w:p>
       <w:pPr>
         <w:rPr/>
+        <w:spacing w:after="80" w:before="60" w:line="260" w:lineRule="auto"/>
       </w:pPr>
       <w:r>
         <w:rPr>
@@ -1169,6 +1170,7 @@
       <w:pPr>
         <w:pStyle w:val="Heading2"/>
         <w:rPr/>
+        <w:spacing w:after="80" w:before="60" w:line="260" w:lineRule="auto"/>
       </w:pPr>
       <w:r>
         <w:rPr>
@@ -1180,6 +1182,7 @@
     <w:p>
       <w:pPr>
         <w:rPr/>
+        <w:spacing w:after="80" w:before="60" w:line="260" w:lineRule="auto"/>
       </w:pPr>
       <w:r>
         <w:rPr>
@@ -1192,6 +1195,7 @@
       <w:pPr>
         <w:pStyle w:val="Heading2"/>
         <w:rPr/>
+        <w:spacing w:after="80" w:before="60" w:line="260" w:lineRule="auto"/>
       </w:pPr>
       <w:r>
         <w:rPr>
@@ -1203,22 +1207,13 @@
     <w:p>
       <w:pPr>
         <w:rPr/>
+        <w:spacing w:after="80" w:before="60" w:line="260" w:lineRule="auto"/>
       </w:pPr>
       <w:r>
         <w:rPr>
           <w:rtl w:val="0"/>
         </w:rPr>
         <w:t xml:space="preserve">MMI máxima describe una estimación del movimiento del suelo dentro del municipio, no la cantidad de daño ni la población que experimentó ese máximo. El USGS explica que la intensidad instrumental se estima con observaciones y modelos. Un bajo solapamiento con el riesgo de largo plazo no demuestra un fallo: ambas variables responden preguntas distintas. Véase la referencia USGS del apéndice.</w:t>
-      </w:r>
-    </w:p>
-    <w:p>
-      <w:pPr>
-        <w:rPr/>
-      </w:pPr>
-      <w:r>
-        <w:rPr>
-          <w:rtl w:val="0"/>
-        </w:rPr>
       </w:r>
     </w:p>
     <w:p>
@@ -1235,7 +1230,7 @@
           <w:between w:space="0" w:sz="0" w:val="nil"/>
         </w:pBdr>
         <w:shd w:fill="f2f2f2" w:val="clear"/>
-        <w:spacing w:after="200" w:before="160" w:line="269" w:lineRule="auto"/>
+        <w:spacing w:after="80" w:before="60" w:line="260" w:lineRule="auto"/>
         <w:ind w:left="259" w:right="259" w:firstLine="0"/>
         <w:jc w:val="left"/>
         <w:rPr/>
@@ -1280,34 +1275,25 @@
         </w:rPr>
       </w:r>
     </w:p>
+    <w:bookmarkStart w:colFirst="0" w:colLast="0" w:name="bookmark=id.suv0vlq0gz4r" w:id="5"/>
+    <w:bookmarkEnd w:id="5"/>
     <w:p>
       <w:pPr>
         <w:pStyle w:val="Heading2"/>
         <w:rPr/>
-      </w:pPr>
-      <w:r>
-        <w:rPr>
-          <w:rtl w:val="0"/>
-        </w:rPr>
-      </w:r>
-    </w:p>
-    <w:bookmarkStart w:colFirst="0" w:colLast="0" w:name="bookmark=id.suv0vlq0gz4r" w:id="5"/>
-    <w:bookmarkEnd w:id="5"/>
-    <w:p>
-      <w:pPr>
-        <w:pStyle w:val="Heading2"/>
+        <w:spacing w:after="80" w:before="60" w:line="260" w:lineRule="auto"/>
+      </w:pPr>
+      <w:r>
+        <w:rPr>
+          <w:rtl w:val="0"/>
+        </w:rPr>
+        <w:t xml:space="preserve">Listas y facilidad de uso</w:t>
+      </w:r>
+    </w:p>
+    <w:p>
+      <w:pPr>
         <w:rPr/>
-      </w:pPr>
-      <w:r>
-        <w:rPr>
-          <w:rtl w:val="0"/>
-        </w:rPr>
-        <w:t xml:space="preserve">Listas y facilidad de uso</w:t>
-      </w:r>
-    </w:p>
-    <w:p>
-      <w:pPr>
-        <w:rPr/>
+        <w:spacing w:after="80" w:before="60" w:line="260" w:lineRule="auto"/>
       </w:pPr>
       <w:r>
         <w:rPr>
@@ -2421,6 +2407,7 @@
     <w:p>
       <w:pPr>
         <w:rPr/>
+        <w:spacing w:after="80" w:before="60" w:line="260" w:lineRule="auto"/>
       </w:pPr>
       <w:r>
         <w:rPr>
@@ -2432,6 +2419,7 @@
     <w:p>
       <w:pPr>
         <w:rPr/>
+        <w:spacing w:after="80" w:before="60" w:line="260" w:lineRule="auto"/>
       </w:pPr>
       <w:r>
         <w:rPr>
@@ -2446,6 +2434,7 @@
       <w:pPr>
         <w:pStyle w:val="Heading2"/>
         <w:rPr/>
+        <w:spacing w:after="80" w:before="60" w:line="260" w:lineRule="auto"/>
       </w:pPr>
       <w:r>
         <w:rPr>
@@ -2472,7 +2461,7 @@
           <w:between w:space="0" w:sz="0" w:val="nil"/>
         </w:pBdr>
         <w:shd w:fill="auto" w:val="clear"/>
-        <w:spacing w:after="100" w:before="0" w:line="276" w:lineRule="auto"/>
+        <w:spacing w:after="80" w:before="60" w:line="260" w:lineRule="auto"/>
         <w:ind w:left="540" w:right="0" w:hanging="270"/>
         <w:jc w:val="left"/>
         <w:rPr/>
@@ -2515,7 +2504,7 @@
           <w:between w:space="0" w:sz="0" w:val="nil"/>
         </w:pBdr>
         <w:shd w:fill="auto" w:val="clear"/>
-        <w:spacing w:after="100" w:before="0" w:line="276" w:lineRule="auto"/>
+        <w:spacing w:after="80" w:before="60" w:line="260" w:lineRule="auto"/>
         <w:ind w:left="540" w:right="0" w:hanging="270"/>
         <w:jc w:val="left"/>
         <w:rPr/>
@@ -2558,7 +2547,7 @@
           <w:between w:space="0" w:sz="0" w:val="nil"/>
         </w:pBdr>
         <w:shd w:fill="auto" w:val="clear"/>
-        <w:spacing w:after="100" w:before="0" w:line="276" w:lineRule="auto"/>
+        <w:spacing w:after="80" w:before="60" w:line="260" w:lineRule="auto"/>
         <w:ind w:left="540" w:right="0" w:hanging="270"/>
         <w:jc w:val="left"/>
         <w:rPr/>
@@ -2601,7 +2590,7 @@
           <w:between w:space="0" w:sz="0" w:val="nil"/>
         </w:pBdr>
         <w:shd w:fill="auto" w:val="clear"/>
-        <w:spacing w:after="100" w:before="0" w:line="276" w:lineRule="auto"/>
+        <w:spacing w:after="80" w:before="60" w:line="260" w:lineRule="auto"/>
         <w:ind w:left="540" w:right="0" w:hanging="270"/>
         <w:jc w:val="left"/>
         <w:rPr/>
@@ -2634,38 +2623,13 @@
         <w:widowControl w:val="1"/>
         <w:pBdr>
           <w:top w:space="0" w:sz="0" w:val="nil"/>
-          <w:left w:space="0" w:sz="0" w:val="nil"/>
-          <w:bottom w:space="0" w:sz="0" w:val="nil"/>
-          <w:right w:space="0" w:sz="0" w:val="nil"/>
-          <w:between w:space="0" w:sz="0" w:val="nil"/>
-        </w:pBdr>
-        <w:shd w:fill="auto" w:val="clear"/>
-        <w:spacing w:after="100" w:before="0" w:line="276" w:lineRule="auto"/>
-        <w:ind w:left="0" w:right="0" w:firstLine="0"/>
-        <w:jc w:val="left"/>
-        <w:rPr/>
-      </w:pPr>
-      <w:r>
-        <w:rPr>
-          <w:rtl w:val="0"/>
-        </w:rPr>
-      </w:r>
-    </w:p>
-    <w:p>
-      <w:pPr>
-        <w:keepNext w:val="0"/>
-        <w:keepLines w:val="1"/>
-        <w:pageBreakBefore w:val="0"/>
-        <w:widowControl w:val="1"/>
-        <w:pBdr>
-          <w:top w:space="0" w:sz="0" w:val="nil"/>
           <w:left w:color="595959" w:space="8" w:sz="16" w:val="single"/>
           <w:bottom w:space="0" w:sz="0" w:val="nil"/>
           <w:right w:space="0" w:sz="0" w:val="nil"/>
           <w:between w:space="0" w:sz="0" w:val="nil"/>
         </w:pBdr>
         <w:shd w:fill="f2f2f2" w:val="clear"/>
-        <w:spacing w:after="200" w:before="160" w:line="269" w:lineRule="auto"/>
+        <w:spacing w:after="80" w:before="60" w:line="260" w:lineRule="auto"/>
         <w:ind w:left="259" w:right="259" w:firstLine="0"/>
         <w:jc w:val="left"/>
         <w:rPr>
@@ -2697,7 +2661,7 @@
           <w:vertAlign w:val="baseline"/>
           <w:rtl w:val="0"/>
         </w:rPr>
-        <w:t xml:space="preserve">Verificación del archivo. Se recorrieron las 28 entradas sin excepciones JavaScript en escritorio y se probaron persistencia y desbordamiento móvil. Esto verifica comportamiento, no autentica todas las cifras. Copia recibida: 1.033.905 bytes; SHA-256 509b44d2e342abc31b3801b9c8368a9071aa97653a2bc0cbf1d2656a308c6d36.</w:t>
+        <w:t xml:space="preserve">Verificación: se recorrieron las 28 entradas sin excepciones JavaScript y se probaron persistencia y uso móvil. Esto verifica comportamiento, no autentica las cifras. La huella SHA-256 del original se conserva en el informe ampliado.</w:t>
       </w:r>
       <w:r>
         <w:rPr>

</xml_diff>